<commit_message>
Edited the comprehensive guide and asiigned tasks to everyone with each page assignd to 2 people.
</commit_message>
<xml_diff>
--- a/Compreshensive Guid/Admin Logic.docx
+++ b/Compreshensive Guid/Admin Logic.docx
@@ -2,7 +2,50 @@
 <file path=word/document.xml><?xml version="1.0" encoding="utf-8"?>
 <w:document xmlns:wpc="http://schemas.microsoft.com/office/word/2010/wordprocessingCanvas" xmlns:cx="http://schemas.microsoft.com/office/drawing/2014/chartex" xmlns:cx1="http://schemas.microsoft.com/office/drawing/2015/9/8/chartex" xmlns:mc="http://schemas.openxmlformats.org/markup-compatibility/2006" xmlns:o="urn:schemas-microsoft-com:office:office" xmlns:r="http://schemas.openxmlformats.org/officeDocument/2006/relationships" xmlns:m="http://schemas.openxmlformats.org/officeDocument/2006/math" xmlns:v="urn:schemas-microsoft-com:vml" xmlns:wp14="http://schemas.microsoft.com/office/word/2010/wordprocessingDrawing" xmlns:wp="http://schemas.openxmlformats.org/drawingml/2006/wordprocessingDrawing" xmlns:w10="urn:schemas-microsoft-com:office:word" xmlns:w="http://schemas.openxmlformats.org/wordprocessingml/2006/main" xmlns:w14="http://schemas.microsoft.com/office/word/2010/wordml" xmlns:w15="http://schemas.microsoft.com/office/word/2012/wordml" xmlns:w16se="http://schemas.microsoft.com/office/word/2015/wordml/symex" xmlns:wpg="http://schemas.microsoft.com/office/word/2010/wordprocessingGroup" xmlns:wpi="http://schemas.microsoft.com/office/word/2010/wordprocessingInk" xmlns:wne="http://schemas.microsoft.com/office/word/2006/wordml" xmlns:wps="http://schemas.microsoft.com/office/word/2010/wordprocessingShape" mc:Ignorable="w14 w15 w16se wp14">
   <w:body>
-    <w:p/>
+    <w:p>
+      <w:pPr>
+        <w:jc w:val="center"/>
+        <w:rPr>
+          <w:b/>
+          <w:sz w:val="30"/>
+          <w:szCs w:val="30"/>
+        </w:rPr>
+      </w:pPr>
+      <w:r>
+        <w:rPr>
+          <w:b/>
+          <w:sz w:val="30"/>
+          <w:szCs w:val="30"/>
+        </w:rPr>
+        <w:t xml:space="preserve">Assigned: </w:t>
+      </w:r>
+      <w:proofErr w:type="spellStart"/>
+      <w:r>
+        <w:rPr>
+          <w:b/>
+          <w:sz w:val="30"/>
+          <w:szCs w:val="30"/>
+        </w:rPr>
+        <w:t>Nyando</w:t>
+      </w:r>
+      <w:proofErr w:type="spellEnd"/>
+      <w:r>
+        <w:rPr>
+          <w:b/>
+          <w:sz w:val="30"/>
+          <w:szCs w:val="30"/>
+        </w:rPr>
+        <w:t xml:space="preserve"> &amp; </w:t>
+      </w:r>
+      <w:r>
+        <w:rPr>
+          <w:b/>
+          <w:sz w:val="30"/>
+          <w:szCs w:val="30"/>
+        </w:rPr>
+        <w:t>Awesome</w:t>
+      </w:r>
+    </w:p>
     <w:p>
       <w:pPr>
         <w:pStyle w:val="ListParagraph"/>
@@ -14,6 +57,8 @@
       <w:r>
         <w:t>Admin Dashboard</w:t>
       </w:r>
+      <w:bookmarkStart w:id="0" w:name="_GoBack"/>
+      <w:bookmarkEnd w:id="0"/>
     </w:p>
     <w:p>
       <w:pPr>
@@ -1301,8 +1346,6 @@
         <w:lastRenderedPageBreak/>
         <w:t>PUT - Update Bus:</w:t>
       </w:r>
-      <w:bookmarkStart w:id="0" w:name="_GoBack"/>
-      <w:bookmarkEnd w:id="0"/>
     </w:p>
     <w:p>
       <w:r>

</xml_diff>